<commit_message>
Update TS 6.3 Tamil Krama Paatam Corrections.docx
</commit_message>
<xml_diff>
--- a/TS-Kramam/TS-6.3/TS 6.3 Tamil Krama Paatam Corrections.docx
+++ b/TS-Kramam/TS-6.3/TS 6.3 Tamil Krama Paatam Corrections.docx
@@ -13,6 +13,16 @@
           <w:u w:val="single"/>
         </w:rPr>
       </w:pPr>
+      <w:r>
+        <w:rPr>
+          <w:b/>
+          <w:bCs/>
+          <w:sz w:val="32"/>
+          <w:szCs w:val="32"/>
+          <w:u w:val="single"/>
+        </w:rPr>
+        <w:t xml:space="preserve"> </w:t>
+      </w:r>
       <w:r>
         <w:rPr>
           <w:b/>
@@ -81,7 +91,18 @@
           <w:szCs w:val="32"/>
           <w:u w:val="single"/>
         </w:rPr>
-        <w:t xml:space="preserve">Observed till </w:t>
+        <w:t xml:space="preserve">Observed </w:t>
+      </w:r>
+      <w:proofErr w:type="gramStart"/>
+      <w:r>
+        <w:rPr>
+          <w:b/>
+          <w:bCs/>
+          <w:sz w:val="32"/>
+          <w:szCs w:val="32"/>
+          <w:u w:val="single"/>
+        </w:rPr>
+        <w:t xml:space="preserve">till </w:t>
       </w:r>
       <w:r>
         <w:rPr>
@@ -94,6 +115,7 @@
         </w:rPr>
         <w:t>????</w:t>
       </w:r>
+      <w:proofErr w:type="gramEnd"/>
     </w:p>
     <w:p>
       <w:pPr>
@@ -258,6 +280,7 @@
                 <w:szCs w:val="28"/>
               </w:rPr>
             </w:pPr>
+            <w:proofErr w:type="gramStart"/>
             <w:r>
               <w:rPr>
                 <w:rFonts w:cs="Arial"/>
@@ -283,7 +306,17 @@
                 <w:sz w:val="28"/>
                 <w:szCs w:val="28"/>
               </w:rPr>
-              <w:t xml:space="preserve">  – Kramam</w:t>
+              <w:t xml:space="preserve">  –</w:t>
+            </w:r>
+            <w:proofErr w:type="gramEnd"/>
+            <w:r>
+              <w:rPr>
+                <w:rFonts w:cs="Arial"/>
+                <w:b/>
+                <w:sz w:val="28"/>
+                <w:szCs w:val="28"/>
+              </w:rPr>
+              <w:t xml:space="preserve"> Kramam</w:t>
             </w:r>
           </w:p>
           <w:p>
@@ -690,6 +723,7 @@
                 <w:szCs w:val="28"/>
               </w:rPr>
             </w:pPr>
+            <w:proofErr w:type="gramStart"/>
             <w:r>
               <w:rPr>
                 <w:rFonts w:cs="Arial"/>
@@ -724,7 +758,17 @@
                 <w:sz w:val="28"/>
                 <w:szCs w:val="28"/>
               </w:rPr>
-              <w:t xml:space="preserve">  – Kramam</w:t>
+              <w:t xml:space="preserve">  –</w:t>
+            </w:r>
+            <w:proofErr w:type="gramEnd"/>
+            <w:r>
+              <w:rPr>
+                <w:rFonts w:cs="Arial"/>
+                <w:b/>
+                <w:sz w:val="28"/>
+                <w:szCs w:val="28"/>
+              </w:rPr>
+              <w:t xml:space="preserve"> Kramam</w:t>
             </w:r>
           </w:p>
           <w:p>
@@ -1333,6 +1377,7 @@
                 <w:szCs w:val="28"/>
               </w:rPr>
             </w:pPr>
+            <w:proofErr w:type="gramStart"/>
             <w:r>
               <w:rPr>
                 <w:rFonts w:cs="Arial"/>
@@ -1349,25 +1394,26 @@
                 <w:sz w:val="28"/>
                 <w:szCs w:val="28"/>
               </w:rPr>
-              <w:t>2.</w:t>
-            </w:r>
-            <w:r>
-              <w:rPr>
-                <w:rFonts w:cs="Arial"/>
-                <w:b/>
-                <w:sz w:val="28"/>
-                <w:szCs w:val="28"/>
-              </w:rPr>
-              <w:t>1</w:t>
-            </w:r>
-            <w:r>
-              <w:rPr>
-                <w:rFonts w:cs="Arial"/>
-                <w:b/>
-                <w:sz w:val="28"/>
-                <w:szCs w:val="28"/>
-              </w:rPr>
-              <w:t xml:space="preserve">  – Kramam</w:t>
+              <w:t>2.1</w:t>
+            </w:r>
+            <w:r>
+              <w:rPr>
+                <w:rFonts w:cs="Arial"/>
+                <w:b/>
+                <w:sz w:val="28"/>
+                <w:szCs w:val="28"/>
+              </w:rPr>
+              <w:t xml:space="preserve">  –</w:t>
+            </w:r>
+            <w:proofErr w:type="gramEnd"/>
+            <w:r>
+              <w:rPr>
+                <w:rFonts w:cs="Arial"/>
+                <w:b/>
+                <w:sz w:val="28"/>
+                <w:szCs w:val="28"/>
+              </w:rPr>
+              <w:t xml:space="preserve"> Kramam</w:t>
             </w:r>
           </w:p>
           <w:p>
@@ -1407,17 +1453,7 @@
                 <w:szCs w:val="28"/>
                 <w:lang w:val="en-IN"/>
               </w:rPr>
-              <w:t xml:space="preserve"> </w:t>
-            </w:r>
-            <w:r>
-              <w:rPr>
-                <w:rFonts w:cs="Arial"/>
-                <w:b/>
-                <w:sz w:val="28"/>
-                <w:szCs w:val="28"/>
-                <w:lang w:val="en-IN"/>
-              </w:rPr>
-              <w:t>10</w:t>
+              <w:t xml:space="preserve"> 10</w:t>
             </w:r>
           </w:p>
           <w:p>
@@ -2075,6 +2111,7 @@
                 <w:szCs w:val="28"/>
               </w:rPr>
             </w:pPr>
+            <w:proofErr w:type="gramStart"/>
             <w:r>
               <w:rPr>
                 <w:rFonts w:cs="Arial"/>
@@ -2091,25 +2128,26 @@
                 <w:sz w:val="28"/>
                 <w:szCs w:val="28"/>
               </w:rPr>
-              <w:t>3</w:t>
-            </w:r>
-            <w:r>
-              <w:rPr>
-                <w:rFonts w:cs="Arial"/>
-                <w:b/>
-                <w:sz w:val="28"/>
-                <w:szCs w:val="28"/>
-              </w:rPr>
-              <w:t>.1</w:t>
-            </w:r>
-            <w:r>
-              <w:rPr>
-                <w:rFonts w:cs="Arial"/>
-                <w:b/>
-                <w:sz w:val="28"/>
-                <w:szCs w:val="28"/>
-              </w:rPr>
-              <w:t xml:space="preserve">  – Kramam</w:t>
+              <w:t>3.1</w:t>
+            </w:r>
+            <w:r>
+              <w:rPr>
+                <w:rFonts w:cs="Arial"/>
+                <w:b/>
+                <w:sz w:val="28"/>
+                <w:szCs w:val="28"/>
+              </w:rPr>
+              <w:t xml:space="preserve">  –</w:t>
+            </w:r>
+            <w:proofErr w:type="gramEnd"/>
+            <w:r>
+              <w:rPr>
+                <w:rFonts w:cs="Arial"/>
+                <w:b/>
+                <w:sz w:val="28"/>
+                <w:szCs w:val="28"/>
+              </w:rPr>
+              <w:t xml:space="preserve"> Kramam</w:t>
             </w:r>
           </w:p>
           <w:p>
@@ -2573,6 +2611,7 @@
                 <w:szCs w:val="28"/>
               </w:rPr>
             </w:pPr>
+            <w:proofErr w:type="gramStart"/>
             <w:r>
               <w:rPr>
                 <w:rFonts w:cs="Arial"/>
@@ -2598,7 +2637,17 @@
                 <w:sz w:val="28"/>
                 <w:szCs w:val="28"/>
               </w:rPr>
-              <w:t xml:space="preserve">  – Kramam</w:t>
+              <w:t xml:space="preserve">  –</w:t>
+            </w:r>
+            <w:proofErr w:type="gramEnd"/>
+            <w:r>
+              <w:rPr>
+                <w:rFonts w:cs="Arial"/>
+                <w:b/>
+                <w:sz w:val="28"/>
+                <w:szCs w:val="28"/>
+              </w:rPr>
+              <w:t xml:space="preserve"> Kramam</w:t>
             </w:r>
           </w:p>
           <w:p>
@@ -3026,6 +3075,7 @@
                 <w:szCs w:val="28"/>
               </w:rPr>
             </w:pPr>
+            <w:proofErr w:type="gramStart"/>
             <w:r>
               <w:rPr>
                 <w:rFonts w:cs="Arial"/>
@@ -3034,7 +3084,17 @@
                 <w:szCs w:val="28"/>
               </w:rPr>
               <w:lastRenderedPageBreak/>
-              <w:t>T.S.6.3.3.6  – Kramam</w:t>
+              <w:t>T.S.6.3.3.6  –</w:t>
+            </w:r>
+            <w:proofErr w:type="gramEnd"/>
+            <w:r>
+              <w:rPr>
+                <w:rFonts w:cs="Arial"/>
+                <w:b/>
+                <w:sz w:val="28"/>
+                <w:szCs w:val="28"/>
+              </w:rPr>
+              <w:t xml:space="preserve"> Kramam</w:t>
             </w:r>
           </w:p>
           <w:p>
@@ -3535,6 +3595,7 @@
                 <w:szCs w:val="28"/>
               </w:rPr>
             </w:pPr>
+            <w:proofErr w:type="gramStart"/>
             <w:r>
               <w:rPr>
                 <w:rFonts w:cs="Arial"/>
@@ -3578,7 +3639,17 @@
                 <w:sz w:val="28"/>
                 <w:szCs w:val="28"/>
               </w:rPr>
-              <w:t xml:space="preserve">  – Kramam</w:t>
+              <w:t xml:space="preserve">  –</w:t>
+            </w:r>
+            <w:proofErr w:type="gramEnd"/>
+            <w:r>
+              <w:rPr>
+                <w:rFonts w:cs="Arial"/>
+                <w:b/>
+                <w:sz w:val="28"/>
+                <w:szCs w:val="28"/>
+              </w:rPr>
+              <w:t xml:space="preserve"> Kramam</w:t>
             </w:r>
           </w:p>
           <w:p>
@@ -4038,6 +4109,7 @@
                 <w:szCs w:val="28"/>
               </w:rPr>
             </w:pPr>
+            <w:proofErr w:type="gramStart"/>
             <w:r>
               <w:rPr>
                 <w:rFonts w:cs="Arial"/>
@@ -4081,7 +4153,17 @@
                 <w:sz w:val="28"/>
                 <w:szCs w:val="28"/>
               </w:rPr>
-              <w:t xml:space="preserve">  – Kramam</w:t>
+              <w:t xml:space="preserve">  –</w:t>
+            </w:r>
+            <w:proofErr w:type="gramEnd"/>
+            <w:r>
+              <w:rPr>
+                <w:rFonts w:cs="Arial"/>
+                <w:b/>
+                <w:sz w:val="28"/>
+                <w:szCs w:val="28"/>
+              </w:rPr>
+              <w:t xml:space="preserve"> Kramam</w:t>
             </w:r>
           </w:p>
           <w:p>
@@ -4389,6 +4471,7 @@
                 <w:szCs w:val="28"/>
               </w:rPr>
             </w:pPr>
+            <w:proofErr w:type="gramStart"/>
             <w:r>
               <w:rPr>
                 <w:rFonts w:cs="Arial"/>
@@ -4423,7 +4506,17 @@
                 <w:sz w:val="28"/>
                 <w:szCs w:val="28"/>
               </w:rPr>
-              <w:t xml:space="preserve">  – Kramam</w:t>
+              <w:t xml:space="preserve">  –</w:t>
+            </w:r>
+            <w:proofErr w:type="gramEnd"/>
+            <w:r>
+              <w:rPr>
+                <w:rFonts w:cs="Arial"/>
+                <w:b/>
+                <w:sz w:val="28"/>
+                <w:szCs w:val="28"/>
+              </w:rPr>
+              <w:t xml:space="preserve"> Kramam</w:t>
             </w:r>
           </w:p>
           <w:p>
@@ -5066,6 +5159,7 @@
                 <w:szCs w:val="28"/>
               </w:rPr>
             </w:pPr>
+            <w:proofErr w:type="gramStart"/>
             <w:r>
               <w:rPr>
                 <w:rFonts w:cs="Arial"/>
@@ -5082,34 +5176,26 @@
                 <w:sz w:val="28"/>
                 <w:szCs w:val="28"/>
               </w:rPr>
-              <w:t>9</w:t>
-            </w:r>
-            <w:r>
-              <w:rPr>
-                <w:rFonts w:cs="Arial"/>
-                <w:b/>
-                <w:sz w:val="28"/>
-                <w:szCs w:val="28"/>
-              </w:rPr>
-              <w:t>.</w:t>
-            </w:r>
-            <w:r>
-              <w:rPr>
-                <w:rFonts w:cs="Arial"/>
-                <w:b/>
-                <w:sz w:val="28"/>
-                <w:szCs w:val="28"/>
-              </w:rPr>
-              <w:t>1</w:t>
-            </w:r>
-            <w:r>
-              <w:rPr>
-                <w:rFonts w:cs="Arial"/>
-                <w:b/>
-                <w:sz w:val="28"/>
-                <w:szCs w:val="28"/>
-              </w:rPr>
-              <w:t xml:space="preserve">  – Kramam</w:t>
+              <w:t>9.1</w:t>
+            </w:r>
+            <w:r>
+              <w:rPr>
+                <w:rFonts w:cs="Arial"/>
+                <w:b/>
+                <w:sz w:val="28"/>
+                <w:szCs w:val="28"/>
+              </w:rPr>
+              <w:t xml:space="preserve">  –</w:t>
+            </w:r>
+            <w:proofErr w:type="gramEnd"/>
+            <w:r>
+              <w:rPr>
+                <w:rFonts w:cs="Arial"/>
+                <w:b/>
+                <w:sz w:val="28"/>
+                <w:szCs w:val="28"/>
+              </w:rPr>
+              <w:t xml:space="preserve"> Kramam</w:t>
             </w:r>
           </w:p>
           <w:p>
@@ -5428,6 +5514,7 @@
                 <w:szCs w:val="28"/>
               </w:rPr>
             </w:pPr>
+            <w:proofErr w:type="gramStart"/>
             <w:r>
               <w:rPr>
                 <w:rFonts w:cs="Arial"/>
@@ -5444,25 +5531,26 @@
                 <w:sz w:val="28"/>
                 <w:szCs w:val="28"/>
               </w:rPr>
-              <w:t>9.</w:t>
-            </w:r>
-            <w:r>
-              <w:rPr>
-                <w:rFonts w:cs="Arial"/>
-                <w:b/>
-                <w:sz w:val="28"/>
-                <w:szCs w:val="28"/>
-              </w:rPr>
-              <w:t>3</w:t>
-            </w:r>
-            <w:r>
-              <w:rPr>
-                <w:rFonts w:cs="Arial"/>
-                <w:b/>
-                <w:sz w:val="28"/>
-                <w:szCs w:val="28"/>
-              </w:rPr>
-              <w:t xml:space="preserve">  – Kramam</w:t>
+              <w:t>9.3</w:t>
+            </w:r>
+            <w:r>
+              <w:rPr>
+                <w:rFonts w:cs="Arial"/>
+                <w:b/>
+                <w:sz w:val="28"/>
+                <w:szCs w:val="28"/>
+              </w:rPr>
+              <w:t xml:space="preserve">  –</w:t>
+            </w:r>
+            <w:proofErr w:type="gramEnd"/>
+            <w:r>
+              <w:rPr>
+                <w:rFonts w:cs="Arial"/>
+                <w:b/>
+                <w:sz w:val="28"/>
+                <w:szCs w:val="28"/>
+              </w:rPr>
+              <w:t xml:space="preserve"> Kramam</w:t>
             </w:r>
           </w:p>
           <w:p>
@@ -5541,17 +5629,7 @@
                 <w:szCs w:val="28"/>
                 <w:lang w:val="it-IT"/>
               </w:rPr>
-              <w:t>4</w:t>
-            </w:r>
-            <w:r>
-              <w:rPr>
-                <w:rFonts w:cs="Arial"/>
-                <w:b/>
-                <w:sz w:val="28"/>
-                <w:szCs w:val="28"/>
-                <w:lang w:val="it-IT"/>
-              </w:rPr>
-              <w:t>7</w:t>
+              <w:t>47</w:t>
             </w:r>
           </w:p>
         </w:tc>
@@ -5903,6 +5981,7 @@
                 <w:szCs w:val="28"/>
               </w:rPr>
             </w:pPr>
+            <w:proofErr w:type="gramStart"/>
             <w:r>
               <w:rPr>
                 <w:rFonts w:cs="Arial"/>
@@ -5928,7 +6007,17 @@
                 <w:sz w:val="28"/>
                 <w:szCs w:val="28"/>
               </w:rPr>
-              <w:t xml:space="preserve">  – Kramam</w:t>
+              <w:t xml:space="preserve">  –</w:t>
+            </w:r>
+            <w:proofErr w:type="gramEnd"/>
+            <w:r>
+              <w:rPr>
+                <w:rFonts w:cs="Arial"/>
+                <w:b/>
+                <w:sz w:val="28"/>
+                <w:szCs w:val="28"/>
+              </w:rPr>
+              <w:t xml:space="preserve"> Kramam</w:t>
             </w:r>
           </w:p>
           <w:p>
@@ -6759,6 +6848,7 @@
                 <w:szCs w:val="32"/>
               </w:rPr>
             </w:pPr>
+            <w:proofErr w:type="gramStart"/>
             <w:r>
               <w:rPr>
                 <w:rFonts w:cs="Arial"/>
@@ -6784,7 +6874,17 @@
                 <w:sz w:val="28"/>
                 <w:szCs w:val="32"/>
               </w:rPr>
-              <w:t xml:space="preserve"> – Kramam</w:t>
+              <w:t xml:space="preserve"> –</w:t>
+            </w:r>
+            <w:proofErr w:type="gramEnd"/>
+            <w:r>
+              <w:rPr>
+                <w:rFonts w:cs="Arial"/>
+                <w:b/>
+                <w:sz w:val="28"/>
+                <w:szCs w:val="32"/>
+              </w:rPr>
+              <w:t xml:space="preserve"> Kramam</w:t>
             </w:r>
           </w:p>
           <w:p>
@@ -9380,6 +9480,7 @@
                 <w:szCs w:val="32"/>
               </w:rPr>
             </w:pPr>
+            <w:proofErr w:type="gramStart"/>
             <w:r>
               <w:rPr>
                 <w:rFonts w:cs="Arial"/>
@@ -9388,7 +9489,17 @@
                 <w:szCs w:val="32"/>
               </w:rPr>
               <w:lastRenderedPageBreak/>
-              <w:t>T.S.6.3.2.3  – Kramam</w:t>
+              <w:t>T.S.6.3.2.3  –</w:t>
+            </w:r>
+            <w:proofErr w:type="gramEnd"/>
+            <w:r>
+              <w:rPr>
+                <w:rFonts w:cs="Arial"/>
+                <w:b/>
+                <w:sz w:val="28"/>
+                <w:szCs w:val="32"/>
+              </w:rPr>
+              <w:t xml:space="preserve"> Kramam</w:t>
             </w:r>
           </w:p>
           <w:p>
@@ -12411,14 +12522,25 @@
                 <w:szCs w:val="32"/>
               </w:rPr>
             </w:pPr>
-            <w:r>
-              <w:rPr>
-                <w:rFonts w:cs="Arial"/>
-                <w:b/>
-                <w:sz w:val="28"/>
-                <w:szCs w:val="32"/>
-              </w:rPr>
-              <w:t>T.S.6.3.4.2  – Kramam</w:t>
+            <w:proofErr w:type="gramStart"/>
+            <w:r>
+              <w:rPr>
+                <w:rFonts w:cs="Arial"/>
+                <w:b/>
+                <w:sz w:val="28"/>
+                <w:szCs w:val="32"/>
+              </w:rPr>
+              <w:t>T.S.6.3.4.2  –</w:t>
+            </w:r>
+            <w:proofErr w:type="gramEnd"/>
+            <w:r>
+              <w:rPr>
+                <w:rFonts w:cs="Arial"/>
+                <w:b/>
+                <w:sz w:val="28"/>
+                <w:szCs w:val="32"/>
+              </w:rPr>
+              <w:t xml:space="preserve"> Kramam</w:t>
             </w:r>
           </w:p>
           <w:p>
@@ -13171,14 +13293,25 @@
                 <w:szCs w:val="32"/>
               </w:rPr>
             </w:pPr>
-            <w:r>
-              <w:rPr>
-                <w:rFonts w:cs="Arial"/>
-                <w:b/>
-                <w:sz w:val="28"/>
-                <w:szCs w:val="32"/>
-              </w:rPr>
-              <w:t>T.S.6.3.4.2  – Kramam</w:t>
+            <w:proofErr w:type="gramStart"/>
+            <w:r>
+              <w:rPr>
+                <w:rFonts w:cs="Arial"/>
+                <w:b/>
+                <w:sz w:val="28"/>
+                <w:szCs w:val="32"/>
+              </w:rPr>
+              <w:t>T.S.6.3.4.2  –</w:t>
+            </w:r>
+            <w:proofErr w:type="gramEnd"/>
+            <w:r>
+              <w:rPr>
+                <w:rFonts w:cs="Arial"/>
+                <w:b/>
+                <w:sz w:val="28"/>
+                <w:szCs w:val="32"/>
+              </w:rPr>
+              <w:t xml:space="preserve"> Kramam</w:t>
             </w:r>
           </w:p>
           <w:p>
@@ -13776,6 +13909,7 @@
                 <w:szCs w:val="32"/>
               </w:rPr>
             </w:pPr>
+            <w:proofErr w:type="gramStart"/>
             <w:r>
               <w:rPr>
                 <w:rFonts w:cs="Arial"/>
@@ -13784,7 +13918,17 @@
                 <w:szCs w:val="32"/>
               </w:rPr>
               <w:lastRenderedPageBreak/>
-              <w:t>T.S.6.3.4.3  – Kramam</w:t>
+              <w:t>T.S.6.3.4.3  –</w:t>
+            </w:r>
+            <w:proofErr w:type="gramEnd"/>
+            <w:r>
+              <w:rPr>
+                <w:rFonts w:cs="Arial"/>
+                <w:b/>
+                <w:sz w:val="28"/>
+                <w:szCs w:val="32"/>
+              </w:rPr>
+              <w:t xml:space="preserve"> Kramam</w:t>
             </w:r>
           </w:p>
           <w:p>
@@ -14428,14 +14572,25 @@
                 <w:szCs w:val="32"/>
               </w:rPr>
             </w:pPr>
-            <w:r>
-              <w:rPr>
-                <w:rFonts w:cs="Arial"/>
-                <w:b/>
-                <w:sz w:val="28"/>
-                <w:szCs w:val="32"/>
-              </w:rPr>
-              <w:t>T.S.6.3.4.6  – Kramam</w:t>
+            <w:proofErr w:type="gramStart"/>
+            <w:r>
+              <w:rPr>
+                <w:rFonts w:cs="Arial"/>
+                <w:b/>
+                <w:sz w:val="28"/>
+                <w:szCs w:val="32"/>
+              </w:rPr>
+              <w:t>T.S.6.3.4.6  –</w:t>
+            </w:r>
+            <w:proofErr w:type="gramEnd"/>
+            <w:r>
+              <w:rPr>
+                <w:rFonts w:cs="Arial"/>
+                <w:b/>
+                <w:sz w:val="28"/>
+                <w:szCs w:val="32"/>
+              </w:rPr>
+              <w:t xml:space="preserve"> Kramam</w:t>
             </w:r>
           </w:p>
           <w:p>
@@ -14842,14 +14997,25 @@
                 <w:szCs w:val="32"/>
               </w:rPr>
             </w:pPr>
-            <w:r>
-              <w:rPr>
-                <w:rFonts w:cs="Arial"/>
-                <w:b/>
-                <w:sz w:val="28"/>
-                <w:szCs w:val="32"/>
-              </w:rPr>
-              <w:t>T.S.6.3.4.8  – Kramam</w:t>
+            <w:proofErr w:type="gramStart"/>
+            <w:r>
+              <w:rPr>
+                <w:rFonts w:cs="Arial"/>
+                <w:b/>
+                <w:sz w:val="28"/>
+                <w:szCs w:val="32"/>
+              </w:rPr>
+              <w:t>T.S.6.3.4.8  –</w:t>
+            </w:r>
+            <w:proofErr w:type="gramEnd"/>
+            <w:r>
+              <w:rPr>
+                <w:rFonts w:cs="Arial"/>
+                <w:b/>
+                <w:sz w:val="28"/>
+                <w:szCs w:val="32"/>
+              </w:rPr>
+              <w:t xml:space="preserve"> Kramam</w:t>
             </w:r>
           </w:p>
           <w:p>
@@ -16421,14 +16587,25 @@
                 <w:szCs w:val="32"/>
               </w:rPr>
             </w:pPr>
-            <w:r>
-              <w:rPr>
-                <w:rFonts w:cs="Arial"/>
-                <w:b/>
-                <w:sz w:val="28"/>
-                <w:szCs w:val="32"/>
-              </w:rPr>
-              <w:t>T.S.6.3.8.3  – Kramam</w:t>
+            <w:proofErr w:type="gramStart"/>
+            <w:r>
+              <w:rPr>
+                <w:rFonts w:cs="Arial"/>
+                <w:b/>
+                <w:sz w:val="28"/>
+                <w:szCs w:val="32"/>
+              </w:rPr>
+              <w:t>T.S.6.3.8.3  –</w:t>
+            </w:r>
+            <w:proofErr w:type="gramEnd"/>
+            <w:r>
+              <w:rPr>
+                <w:rFonts w:cs="Arial"/>
+                <w:b/>
+                <w:sz w:val="28"/>
+                <w:szCs w:val="32"/>
+              </w:rPr>
+              <w:t xml:space="preserve"> Kramam</w:t>
             </w:r>
           </w:p>
           <w:p>
@@ -16874,14 +17051,25 @@
                 <w:szCs w:val="32"/>
               </w:rPr>
             </w:pPr>
-            <w:r>
-              <w:rPr>
-                <w:rFonts w:cs="Arial"/>
-                <w:b/>
-                <w:sz w:val="28"/>
-                <w:szCs w:val="32"/>
-              </w:rPr>
-              <w:t>T.S.6.3.8.4  – Kramam</w:t>
+            <w:proofErr w:type="gramStart"/>
+            <w:r>
+              <w:rPr>
+                <w:rFonts w:cs="Arial"/>
+                <w:b/>
+                <w:sz w:val="28"/>
+                <w:szCs w:val="32"/>
+              </w:rPr>
+              <w:t>T.S.6.3.8.4  –</w:t>
+            </w:r>
+            <w:proofErr w:type="gramEnd"/>
+            <w:r>
+              <w:rPr>
+                <w:rFonts w:cs="Arial"/>
+                <w:b/>
+                <w:sz w:val="28"/>
+                <w:szCs w:val="32"/>
+              </w:rPr>
+              <w:t xml:space="preserve"> Kramam</w:t>
             </w:r>
           </w:p>
           <w:p>
@@ -17347,6 +17535,7 @@
                 <w:szCs w:val="32"/>
               </w:rPr>
             </w:pPr>
+            <w:proofErr w:type="gramStart"/>
             <w:r>
               <w:rPr>
                 <w:rFonts w:cs="Arial"/>
@@ -17355,7 +17544,17 @@
                 <w:szCs w:val="32"/>
               </w:rPr>
               <w:lastRenderedPageBreak/>
-              <w:t>T.S.6.3.9.5  – Kramam</w:t>
+              <w:t>T.S.6.3.9.5  –</w:t>
+            </w:r>
+            <w:proofErr w:type="gramEnd"/>
+            <w:r>
+              <w:rPr>
+                <w:rFonts w:cs="Arial"/>
+                <w:b/>
+                <w:sz w:val="28"/>
+                <w:szCs w:val="32"/>
+              </w:rPr>
+              <w:t xml:space="preserve"> Kramam</w:t>
             </w:r>
           </w:p>
           <w:p>
@@ -18035,14 +18234,25 @@
                 <w:szCs w:val="32"/>
               </w:rPr>
             </w:pPr>
-            <w:r>
-              <w:rPr>
-                <w:rFonts w:cs="Arial"/>
-                <w:b/>
-                <w:sz w:val="28"/>
-                <w:szCs w:val="32"/>
-              </w:rPr>
-              <w:t>T.S.6.3.10.2  – Kramam</w:t>
+            <w:proofErr w:type="gramStart"/>
+            <w:r>
+              <w:rPr>
+                <w:rFonts w:cs="Arial"/>
+                <w:b/>
+                <w:sz w:val="28"/>
+                <w:szCs w:val="32"/>
+              </w:rPr>
+              <w:t>T.S.6.3.10.2  –</w:t>
+            </w:r>
+            <w:proofErr w:type="gramEnd"/>
+            <w:r>
+              <w:rPr>
+                <w:rFonts w:cs="Arial"/>
+                <w:b/>
+                <w:sz w:val="28"/>
+                <w:szCs w:val="32"/>
+              </w:rPr>
+              <w:t xml:space="preserve"> Kramam</w:t>
             </w:r>
           </w:p>
           <w:p>
@@ -20374,7 +20584,16 @@
           <w:bCs/>
           <w:sz w:val="32"/>
         </w:rPr>
-        <w:t>replaced with</w:t>
+        <w:t xml:space="preserve">replaced </w:t>
+      </w:r>
+      <w:proofErr w:type="gramStart"/>
+      <w:r>
+        <w:rPr>
+          <w:b/>
+          <w:bCs/>
+          <w:sz w:val="32"/>
+        </w:rPr>
+        <w:t>with</w:t>
       </w:r>
       <w:r>
         <w:rPr>
@@ -20396,6 +20615,7 @@
         </w:rPr>
         <w:t>"</w:t>
       </w:r>
+      <w:proofErr w:type="gramEnd"/>
       <w:r>
         <w:rPr>
           <w:rFonts w:ascii="Latha" w:hAnsi="Latha" w:cs="Latha"/>

</xml_diff>